<commit_message>
Update UC Pay Order By Credit Card
</commit_message>
<xml_diff>
--- a/RequirementAnalysis/UCSpec/word/PayOrderByCreditCard.docx
+++ b/RequirementAnalysis/UCSpec/word/PayOrderByCreditCard.docx
@@ -28,27 +28,7 @@
           <w:sz w:val="32"/>
           <w:szCs w:val="32"/>
         </w:rPr>
-        <w:t xml:space="preserve">Pay Order </w:t>
-      </w:r>
-      <w:proofErr w:type="gramStart"/>
-      <w:r>
-        <w:rPr>
-          <w:b/>
-          <w:bCs/>
-          <w:sz w:val="32"/>
-          <w:szCs w:val="32"/>
-        </w:rPr>
-        <w:t>By</w:t>
-      </w:r>
-      <w:proofErr w:type="gramEnd"/>
-      <w:r>
-        <w:rPr>
-          <w:b/>
-          <w:bCs/>
-          <w:sz w:val="32"/>
-          <w:szCs w:val="32"/>
-        </w:rPr>
-        <w:t xml:space="preserve"> Credit Card</w:t>
+        <w:t>Pay Order By Credit Card</w:t>
       </w:r>
     </w:p>
     <w:p>
@@ -132,7 +112,6 @@
           <w:lang w:val="vi-VN"/>
         </w:rPr>
       </w:pPr>
-      <w:proofErr w:type="gramStart"/>
       <w:r>
         <w:rPr>
           <w:sz w:val="28"/>
@@ -140,7 +119,6 @@
         </w:rPr>
         <w:t>This use</w:t>
       </w:r>
-      <w:proofErr w:type="gramEnd"/>
       <w:r>
         <w:rPr>
           <w:sz w:val="28"/>
@@ -170,33 +148,15 @@
           <w:szCs w:val="28"/>
           <w:lang w:val="vi-VN"/>
         </w:rPr>
-        <w:t xml:space="preserve"> Paypal </w:t>
-      </w:r>
-      <w:proofErr w:type="gramStart"/>
+        <w:t xml:space="preserve"> Paypal Sandbox </w:t>
+      </w:r>
       <w:r>
         <w:rPr>
           <w:sz w:val="28"/>
           <w:szCs w:val="28"/>
           <w:lang w:val="vi-VN"/>
         </w:rPr>
-        <w:t xml:space="preserve">Sandbox </w:t>
-      </w:r>
-      <w:r>
-        <w:rPr>
-          <w:sz w:val="28"/>
-          <w:szCs w:val="28"/>
-          <w:lang w:val="vi-VN"/>
-        </w:rPr>
-        <w:t xml:space="preserve"> System</w:t>
-      </w:r>
-      <w:proofErr w:type="gramEnd"/>
-      <w:r>
-        <w:rPr>
-          <w:sz w:val="28"/>
-          <w:szCs w:val="28"/>
-          <w:lang w:val="vi-VN"/>
-        </w:rPr>
-        <w:t xml:space="preserve"> and AIMS System </w:t>
+        <w:t xml:space="preserve"> System and AIMS System </w:t>
       </w:r>
       <w:r>
         <w:rPr>
@@ -833,11 +793,19 @@
             <w:tcW w:w="990" w:type="dxa"/>
           </w:tcPr>
           <w:p>
+            <w:pPr>
+              <w:rPr>
+                <w:lang w:val="en-US"/>
+              </w:rPr>
+            </w:pPr>
             <w:r>
               <w:t xml:space="preserve">At Step </w:t>
             </w:r>
             <w:r>
-              <w:t>5</w:t>
+              <w:rPr>
+                <w:lang w:val="en-US"/>
+              </w:rPr>
+              <w:t>4</w:t>
             </w:r>
           </w:p>
         </w:tc>
@@ -850,7 +818,7 @@
               <w:rPr>
                 <w:lang w:val="en-US"/>
               </w:rPr>
-              <w:t>If the PayPal Sandbox API declines the test card (e.g., insufficient funds test card).</w:t>
+              <w:t>If the software fails to connect to the PayPal Sandbox API (timeout or server error).</w:t>
             </w:r>
           </w:p>
         </w:tc>
@@ -871,7 +839,7 @@
               <w:rPr>
                 <w:lang w:val="en-US"/>
               </w:rPr>
-              <w:t>Software logs the failed transaction attempt.</w:t>
+              <w:t>Software logs the system error.</w:t>
             </w:r>
           </w:p>
           <w:p>
@@ -887,7 +855,7 @@
               <w:rPr>
                 <w:lang w:val="en-US"/>
               </w:rPr>
-              <w:t>Software displays a "Payment Declined" error message.</w:t>
+              <w:t>Software displays a "Gateway connection error. Please try again later." message.</w:t>
             </w:r>
           </w:p>
         </w:tc>
@@ -897,7 +865,7 @@
           </w:tcPr>
           <w:p>
             <w:r>
-              <w:t>Resume at Step 2</w:t>
+              <w:t>Use case ends</w:t>
             </w:r>
           </w:p>
         </w:tc>
@@ -937,7 +905,7 @@
               <w:rPr>
                 <w:lang w:val="en-US"/>
               </w:rPr>
-              <w:t>If the software fails to connect to the PayPal Sandbox API (timeout or server error).</w:t>
+              <w:t>If the PayPal Sandbox API declines the test card (e.g., insufficient funds test card).</w:t>
             </w:r>
           </w:p>
         </w:tc>
@@ -958,7 +926,7 @@
               <w:rPr>
                 <w:lang w:val="en-US"/>
               </w:rPr>
-              <w:t>Software logs the system error.</w:t>
+              <w:t>Software logs the failed transaction attempt.</w:t>
             </w:r>
           </w:p>
           <w:p>
@@ -974,7 +942,7 @@
               <w:rPr>
                 <w:lang w:val="en-US"/>
               </w:rPr>
-              <w:t>Software displays a "Gateway connection error. Please try again later." message.</w:t>
+              <w:t>Software displays a "Payment Declined" error message.</w:t>
             </w:r>
           </w:p>
         </w:tc>
@@ -984,7 +952,7 @@
           </w:tcPr>
           <w:p>
             <w:r>
-              <w:t>Use case ends</w:t>
+              <w:t>Resume at Step 2</w:t>
             </w:r>
           </w:p>
         </w:tc>
@@ -1229,21 +1197,7 @@
               <w:rPr>
                 <w:lang w:val="en-US"/>
               </w:rPr>
-              <w:t xml:space="preserve">The 16-digit number </w:t>
-            </w:r>
-            <w:proofErr w:type="gramStart"/>
-            <w:r>
-              <w:rPr>
-                <w:lang w:val="en-US"/>
-              </w:rPr>
-              <w:t>on</w:t>
-            </w:r>
-            <w:proofErr w:type="gramEnd"/>
-            <w:r>
-              <w:rPr>
-                <w:lang w:val="en-US"/>
-              </w:rPr>
-              <w:t xml:space="preserve"> the front of the card.</w:t>
+              <w:t>The 16-digit number on the front of the card.</w:t>
             </w:r>
           </w:p>
         </w:tc>
@@ -2386,16 +2340,8 @@
               <w:rPr>
                 <w:lang w:val="en-US"/>
               </w:rPr>
-              <w:t>Date/Time format (DD/MM/YYYY HH:</w:t>
-            </w:r>
-            <w:proofErr w:type="gramStart"/>
-            <w:r>
-              <w:rPr>
-                <w:lang w:val="en-US"/>
-              </w:rPr>
-              <w:t>MM:SS</w:t>
-            </w:r>
-            <w:proofErr w:type="gramEnd"/>
+              <w:t>Date/Time format (DD/MM/YYYY HH:MM:SS</w:t>
+            </w:r>
             <w:r>
               <w:rPr>
                 <w:lang w:val="en-US"/>

</xml_diff>

<commit_message>
Pay Order By Credit Card UC Spec
</commit_message>
<xml_diff>
--- a/RequirementAnalysis/UCSpec/word/PayOrderByCreditCard.docx
+++ b/RequirementAnalysis/UCSpec/word/PayOrderByCreditCard.docx
@@ -28,27 +28,7 @@
           <w:sz w:val="32"/>
           <w:szCs w:val="32"/>
         </w:rPr>
-        <w:t xml:space="preserve">Pay Order </w:t>
-      </w:r>
-      <w:proofErr w:type="gramStart"/>
-      <w:r>
-        <w:rPr>
-          <w:b/>
-          <w:bCs/>
-          <w:sz w:val="32"/>
-          <w:szCs w:val="32"/>
-        </w:rPr>
-        <w:t>By</w:t>
-      </w:r>
-      <w:proofErr w:type="gramEnd"/>
-      <w:r>
-        <w:rPr>
-          <w:b/>
-          <w:bCs/>
-          <w:sz w:val="32"/>
-          <w:szCs w:val="32"/>
-        </w:rPr>
-        <w:t xml:space="preserve"> Credit Card</w:t>
+        <w:t>Pay Order By Credit Card</w:t>
       </w:r>
     </w:p>
     <w:p>
@@ -132,7 +112,6 @@
           <w:lang w:val="vi-VN"/>
         </w:rPr>
       </w:pPr>
-      <w:proofErr w:type="gramStart"/>
       <w:r>
         <w:rPr>
           <w:sz w:val="28"/>
@@ -140,7 +119,6 @@
         </w:rPr>
         <w:t>This use</w:t>
       </w:r>
-      <w:proofErr w:type="gramEnd"/>
       <w:r>
         <w:rPr>
           <w:sz w:val="28"/>
@@ -170,33 +148,15 @@
           <w:szCs w:val="28"/>
           <w:lang w:val="vi-VN"/>
         </w:rPr>
-        <w:t xml:space="preserve"> Paypal </w:t>
-      </w:r>
-      <w:proofErr w:type="gramStart"/>
+        <w:t xml:space="preserve"> Paypal Sandbox </w:t>
+      </w:r>
       <w:r>
         <w:rPr>
           <w:sz w:val="28"/>
           <w:szCs w:val="28"/>
           <w:lang w:val="vi-VN"/>
         </w:rPr>
-        <w:t xml:space="preserve">Sandbox </w:t>
-      </w:r>
-      <w:r>
-        <w:rPr>
-          <w:sz w:val="28"/>
-          <w:szCs w:val="28"/>
-          <w:lang w:val="vi-VN"/>
-        </w:rPr>
-        <w:t xml:space="preserve"> System</w:t>
-      </w:r>
-      <w:proofErr w:type="gramEnd"/>
-      <w:r>
-        <w:rPr>
-          <w:sz w:val="28"/>
-          <w:szCs w:val="28"/>
-          <w:lang w:val="vi-VN"/>
-        </w:rPr>
-        <w:t xml:space="preserve"> and AIMS System </w:t>
+        <w:t xml:space="preserve"> System and AIMS System </w:t>
       </w:r>
       <w:r>
         <w:rPr>
@@ -501,7 +461,10 @@
         <w:t>.</w:t>
       </w:r>
       <w:r>
-        <w:t xml:space="preserve"> The PayPal Sandbox processes the simulated transaction and returns a successful response.</w:t>
+        <w:t xml:space="preserve"> The PayPal Sandbox processes the simulated transaction</w:t>
+      </w:r>
+      <w:r>
+        <w:t>.</w:t>
       </w:r>
     </w:p>
     <w:p>
@@ -523,16 +486,10 @@
         <w:t>.</w:t>
       </w:r>
       <w:r>
-        <w:t xml:space="preserve"> The software </w:t>
-      </w:r>
-      <w:r>
-        <w:t>r</w:t>
-      </w:r>
-      <w:r>
-        <w:t>eceives successful response</w:t>
-      </w:r>
-      <w:r>
-        <w:t>.</w:t>
+        <w:t xml:space="preserve"> </w:t>
+      </w:r>
+      <w:r>
+        <w:t>The software notifies the payment result.</w:t>
       </w:r>
     </w:p>
     <w:p>
@@ -1246,21 +1203,7 @@
               <w:rPr>
                 <w:lang w:val="en-US"/>
               </w:rPr>
-              <w:t xml:space="preserve">The 16-digit number </w:t>
-            </w:r>
-            <w:proofErr w:type="gramStart"/>
-            <w:r>
-              <w:rPr>
-                <w:lang w:val="en-US"/>
-              </w:rPr>
-              <w:t>on</w:t>
-            </w:r>
-            <w:proofErr w:type="gramEnd"/>
-            <w:r>
-              <w:rPr>
-                <w:lang w:val="en-US"/>
-              </w:rPr>
-              <w:t xml:space="preserve"> the front of the card.</w:t>
+              <w:t>The 16-digit number on the front of the card.</w:t>
             </w:r>
           </w:p>
         </w:tc>
@@ -1576,11 +1519,411 @@
         <w:t>Output data</w:t>
       </w:r>
     </w:p>
+    <w:tbl>
+      <w:tblPr>
+        <w:tblW w:w="0" w:type="auto"/>
+        <w:tblCellMar>
+          <w:top w:w="15" w:type="dxa"/>
+          <w:left w:w="15" w:type="dxa"/>
+          <w:bottom w:w="15" w:type="dxa"/>
+          <w:right w:w="15" w:type="dxa"/>
+        </w:tblCellMar>
+        <w:tblLook w:val="04A0" w:firstRow="1" w:lastRow="0" w:firstColumn="1" w:lastColumn="0" w:noHBand="0" w:noVBand="1"/>
+      </w:tblPr>
+      <w:tblGrid>
+        <w:gridCol w:w="505"/>
+        <w:gridCol w:w="1331"/>
+        <w:gridCol w:w="3045"/>
+        <w:gridCol w:w="3348"/>
+        <w:gridCol w:w="1121"/>
+      </w:tblGrid>
+      <w:tr>
+        <w:trPr>
+          <w:trHeight w:val="300"/>
+        </w:trPr>
+        <w:tc>
+          <w:tcPr>
+            <w:tcW w:w="0" w:type="auto"/>
+            <w:tcBorders>
+              <w:top w:val="single" w:sz="4" w:space="0" w:color="000000"/>
+              <w:left w:val="single" w:sz="4" w:space="0" w:color="000000"/>
+              <w:bottom w:val="single" w:sz="4" w:space="0" w:color="000000"/>
+              <w:right w:val="single" w:sz="4" w:space="0" w:color="000000"/>
+            </w:tcBorders>
+            <w:shd w:val="clear" w:color="auto" w:fill="F1A983"/>
+            <w:tcMar>
+              <w:top w:w="0" w:type="dxa"/>
+              <w:left w:w="105" w:type="dxa"/>
+              <w:bottom w:w="0" w:type="dxa"/>
+              <w:right w:w="105" w:type="dxa"/>
+            </w:tcMar>
+            <w:vAlign w:val="center"/>
+            <w:hideMark/>
+          </w:tcPr>
+          <w:p>
+            <w:pPr>
+              <w:spacing w:line="240" w:lineRule="auto"/>
+              <w:jc w:val="center"/>
+              <w:rPr>
+                <w:szCs w:val="24"/>
+              </w:rPr>
+            </w:pPr>
+            <w:r>
+              <w:rPr>
+                <w:b/>
+                <w:bCs/>
+                <w:color w:val="000000"/>
+                <w:szCs w:val="24"/>
+              </w:rPr>
+              <w:t>No</w:t>
+            </w:r>
+          </w:p>
+        </w:tc>
+        <w:tc>
+          <w:tcPr>
+            <w:tcW w:w="0" w:type="auto"/>
+            <w:tcBorders>
+              <w:top w:val="single" w:sz="4" w:space="0" w:color="000000"/>
+              <w:left w:val="single" w:sz="4" w:space="0" w:color="000000"/>
+              <w:bottom w:val="single" w:sz="4" w:space="0" w:color="000000"/>
+              <w:right w:val="single" w:sz="4" w:space="0" w:color="000000"/>
+            </w:tcBorders>
+            <w:shd w:val="clear" w:color="auto" w:fill="F1A983"/>
+            <w:tcMar>
+              <w:top w:w="0" w:type="dxa"/>
+              <w:left w:w="105" w:type="dxa"/>
+              <w:bottom w:w="0" w:type="dxa"/>
+              <w:right w:w="105" w:type="dxa"/>
+            </w:tcMar>
+            <w:vAlign w:val="center"/>
+            <w:hideMark/>
+          </w:tcPr>
+          <w:p>
+            <w:pPr>
+              <w:spacing w:line="240" w:lineRule="auto"/>
+              <w:ind w:left="4"/>
+              <w:jc w:val="center"/>
+              <w:rPr>
+                <w:szCs w:val="24"/>
+              </w:rPr>
+            </w:pPr>
+            <w:r>
+              <w:rPr>
+                <w:b/>
+                <w:bCs/>
+                <w:color w:val="000000"/>
+                <w:szCs w:val="24"/>
+              </w:rPr>
+              <w:t>Data fields</w:t>
+            </w:r>
+          </w:p>
+        </w:tc>
+        <w:tc>
+          <w:tcPr>
+            <w:tcW w:w="0" w:type="auto"/>
+            <w:tcBorders>
+              <w:top w:val="single" w:sz="4" w:space="0" w:color="000000"/>
+              <w:left w:val="single" w:sz="4" w:space="0" w:color="000000"/>
+              <w:bottom w:val="single" w:sz="4" w:space="0" w:color="000000"/>
+              <w:right w:val="single" w:sz="4" w:space="0" w:color="000000"/>
+            </w:tcBorders>
+            <w:shd w:val="clear" w:color="auto" w:fill="F1A983"/>
+            <w:tcMar>
+              <w:top w:w="0" w:type="dxa"/>
+              <w:left w:w="105" w:type="dxa"/>
+              <w:bottom w:w="0" w:type="dxa"/>
+              <w:right w:w="105" w:type="dxa"/>
+            </w:tcMar>
+            <w:vAlign w:val="center"/>
+            <w:hideMark/>
+          </w:tcPr>
+          <w:p>
+            <w:pPr>
+              <w:spacing w:line="240" w:lineRule="auto"/>
+              <w:ind w:left="4"/>
+              <w:jc w:val="center"/>
+              <w:rPr>
+                <w:szCs w:val="24"/>
+              </w:rPr>
+            </w:pPr>
+            <w:r>
+              <w:rPr>
+                <w:b/>
+                <w:bCs/>
+                <w:color w:val="000000"/>
+                <w:szCs w:val="24"/>
+              </w:rPr>
+              <w:t>Description</w:t>
+            </w:r>
+          </w:p>
+        </w:tc>
+        <w:tc>
+          <w:tcPr>
+            <w:tcW w:w="0" w:type="auto"/>
+            <w:tcBorders>
+              <w:top w:val="single" w:sz="4" w:space="0" w:color="000000"/>
+              <w:left w:val="single" w:sz="4" w:space="0" w:color="000000"/>
+              <w:bottom w:val="single" w:sz="4" w:space="0" w:color="000000"/>
+              <w:right w:val="single" w:sz="4" w:space="0" w:color="000000"/>
+            </w:tcBorders>
+            <w:shd w:val="clear" w:color="auto" w:fill="F1A983"/>
+            <w:tcMar>
+              <w:top w:w="0" w:type="dxa"/>
+              <w:left w:w="105" w:type="dxa"/>
+              <w:bottom w:w="0" w:type="dxa"/>
+              <w:right w:w="105" w:type="dxa"/>
+            </w:tcMar>
+            <w:vAlign w:val="center"/>
+            <w:hideMark/>
+          </w:tcPr>
+          <w:p>
+            <w:pPr>
+              <w:spacing w:line="240" w:lineRule="auto"/>
+              <w:ind w:left="4"/>
+              <w:jc w:val="center"/>
+              <w:rPr>
+                <w:szCs w:val="24"/>
+              </w:rPr>
+            </w:pPr>
+            <w:r>
+              <w:rPr>
+                <w:b/>
+                <w:bCs/>
+                <w:color w:val="000000"/>
+                <w:szCs w:val="24"/>
+              </w:rPr>
+              <w:t>Display format</w:t>
+            </w:r>
+          </w:p>
+        </w:tc>
+        <w:tc>
+          <w:tcPr>
+            <w:tcW w:w="0" w:type="auto"/>
+            <w:tcBorders>
+              <w:top w:val="single" w:sz="4" w:space="0" w:color="000000"/>
+              <w:left w:val="single" w:sz="4" w:space="0" w:color="000000"/>
+              <w:bottom w:val="single" w:sz="4" w:space="0" w:color="000000"/>
+              <w:right w:val="single" w:sz="4" w:space="0" w:color="000000"/>
+            </w:tcBorders>
+            <w:shd w:val="clear" w:color="auto" w:fill="F1A983"/>
+            <w:tcMar>
+              <w:top w:w="0" w:type="dxa"/>
+              <w:left w:w="105" w:type="dxa"/>
+              <w:bottom w:w="0" w:type="dxa"/>
+              <w:right w:w="105" w:type="dxa"/>
+            </w:tcMar>
+            <w:vAlign w:val="center"/>
+            <w:hideMark/>
+          </w:tcPr>
+          <w:p>
+            <w:pPr>
+              <w:spacing w:line="240" w:lineRule="auto"/>
+              <w:ind w:left="4"/>
+              <w:jc w:val="center"/>
+              <w:rPr>
+                <w:szCs w:val="24"/>
+              </w:rPr>
+            </w:pPr>
+            <w:r>
+              <w:rPr>
+                <w:b/>
+                <w:bCs/>
+                <w:color w:val="000000"/>
+                <w:szCs w:val="24"/>
+              </w:rPr>
+              <w:t>Example</w:t>
+            </w:r>
+          </w:p>
+        </w:tc>
+      </w:tr>
+      <w:tr>
+        <w:trPr>
+          <w:trHeight w:val="780"/>
+        </w:trPr>
+        <w:tc>
+          <w:tcPr>
+            <w:tcW w:w="0" w:type="auto"/>
+            <w:tcBorders>
+              <w:top w:val="single" w:sz="4" w:space="0" w:color="000000"/>
+              <w:left w:val="single" w:sz="4" w:space="0" w:color="000000"/>
+              <w:bottom w:val="single" w:sz="4" w:space="0" w:color="000000"/>
+              <w:right w:val="single" w:sz="4" w:space="0" w:color="000000"/>
+            </w:tcBorders>
+            <w:shd w:val="clear" w:color="auto" w:fill="FFFFFF"/>
+            <w:tcMar>
+              <w:top w:w="0" w:type="dxa"/>
+              <w:left w:w="105" w:type="dxa"/>
+              <w:bottom w:w="0" w:type="dxa"/>
+              <w:right w:w="105" w:type="dxa"/>
+            </w:tcMar>
+            <w:vAlign w:val="center"/>
+            <w:hideMark/>
+          </w:tcPr>
+          <w:p>
+            <w:pPr>
+              <w:spacing w:before="0" w:line="240" w:lineRule="auto"/>
+              <w:jc w:val="center"/>
+              <w:rPr>
+                <w:szCs w:val="24"/>
+              </w:rPr>
+            </w:pPr>
+            <w:r>
+              <w:rPr>
+                <w:szCs w:val="24"/>
+              </w:rPr>
+              <w:t>1</w:t>
+            </w:r>
+          </w:p>
+        </w:tc>
+        <w:tc>
+          <w:tcPr>
+            <w:tcW w:w="0" w:type="auto"/>
+            <w:tcBorders>
+              <w:top w:val="single" w:sz="4" w:space="0" w:color="000000"/>
+              <w:left w:val="single" w:sz="4" w:space="0" w:color="000000"/>
+              <w:bottom w:val="single" w:sz="4" w:space="0" w:color="000000"/>
+              <w:right w:val="single" w:sz="4" w:space="0" w:color="000000"/>
+            </w:tcBorders>
+            <w:shd w:val="clear" w:color="auto" w:fill="FFFFFF"/>
+            <w:tcMar>
+              <w:top w:w="0" w:type="dxa"/>
+              <w:left w:w="105" w:type="dxa"/>
+              <w:bottom w:w="0" w:type="dxa"/>
+              <w:right w:w="105" w:type="dxa"/>
+            </w:tcMar>
+            <w:vAlign w:val="center"/>
+            <w:hideMark/>
+          </w:tcPr>
+          <w:p>
+            <w:pPr>
+              <w:spacing w:before="0" w:line="240" w:lineRule="auto"/>
+              <w:jc w:val="center"/>
+              <w:rPr>
+                <w:szCs w:val="24"/>
+              </w:rPr>
+            </w:pPr>
+            <w:r>
+              <w:rPr>
+                <w:color w:val="000000"/>
+                <w:sz w:val="20"/>
+              </w:rPr>
+              <w:t>Payment Status</w:t>
+            </w:r>
+          </w:p>
+        </w:tc>
+        <w:tc>
+          <w:tcPr>
+            <w:tcW w:w="0" w:type="auto"/>
+            <w:tcBorders>
+              <w:top w:val="single" w:sz="4" w:space="0" w:color="000000"/>
+              <w:left w:val="single" w:sz="4" w:space="0" w:color="000000"/>
+              <w:bottom w:val="single" w:sz="4" w:space="0" w:color="000000"/>
+              <w:right w:val="single" w:sz="4" w:space="0" w:color="000000"/>
+            </w:tcBorders>
+            <w:shd w:val="clear" w:color="auto" w:fill="FFFFFF"/>
+            <w:tcMar>
+              <w:top w:w="0" w:type="dxa"/>
+              <w:left w:w="105" w:type="dxa"/>
+              <w:bottom w:w="0" w:type="dxa"/>
+              <w:right w:w="105" w:type="dxa"/>
+            </w:tcMar>
+            <w:vAlign w:val="center"/>
+            <w:hideMark/>
+          </w:tcPr>
+          <w:p>
+            <w:pPr>
+              <w:spacing w:before="0" w:line="240" w:lineRule="auto"/>
+              <w:jc w:val="center"/>
+              <w:rPr>
+                <w:szCs w:val="24"/>
+              </w:rPr>
+            </w:pPr>
+            <w:r>
+              <w:rPr>
+                <w:color w:val="000000"/>
+                <w:sz w:val="20"/>
+              </w:rPr>
+              <w:t>Current status of the payment transaction</w:t>
+            </w:r>
+          </w:p>
+        </w:tc>
+        <w:tc>
+          <w:tcPr>
+            <w:tcW w:w="0" w:type="auto"/>
+            <w:tcBorders>
+              <w:top w:val="single" w:sz="4" w:space="0" w:color="000000"/>
+              <w:left w:val="single" w:sz="4" w:space="0" w:color="000000"/>
+              <w:bottom w:val="single" w:sz="4" w:space="0" w:color="000000"/>
+              <w:right w:val="single" w:sz="4" w:space="0" w:color="000000"/>
+            </w:tcBorders>
+            <w:shd w:val="clear" w:color="auto" w:fill="FFFFFF"/>
+            <w:tcMar>
+              <w:top w:w="0" w:type="dxa"/>
+              <w:left w:w="105" w:type="dxa"/>
+              <w:bottom w:w="0" w:type="dxa"/>
+              <w:right w:w="105" w:type="dxa"/>
+            </w:tcMar>
+            <w:vAlign w:val="center"/>
+            <w:hideMark/>
+          </w:tcPr>
+          <w:p>
+            <w:pPr>
+              <w:spacing w:before="0" w:line="240" w:lineRule="auto"/>
+              <w:jc w:val="center"/>
+              <w:rPr>
+                <w:szCs w:val="24"/>
+              </w:rPr>
+            </w:pPr>
+            <w:r>
+              <w:rPr>
+                <w:color w:val="000000"/>
+                <w:sz w:val="20"/>
+              </w:rPr>
+              <w:t>Text message (Success/Failure/Cancelled)</w:t>
+            </w:r>
+          </w:p>
+        </w:tc>
+        <w:tc>
+          <w:tcPr>
+            <w:tcW w:w="0" w:type="auto"/>
+            <w:tcBorders>
+              <w:top w:val="single" w:sz="4" w:space="0" w:color="000000"/>
+              <w:left w:val="single" w:sz="4" w:space="0" w:color="000000"/>
+              <w:bottom w:val="single" w:sz="4" w:space="0" w:color="000000"/>
+              <w:right w:val="single" w:sz="4" w:space="0" w:color="000000"/>
+            </w:tcBorders>
+            <w:shd w:val="clear" w:color="auto" w:fill="FFFFFF"/>
+            <w:tcMar>
+              <w:top w:w="0" w:type="dxa"/>
+              <w:left w:w="105" w:type="dxa"/>
+              <w:bottom w:w="0" w:type="dxa"/>
+              <w:right w:w="105" w:type="dxa"/>
+            </w:tcMar>
+            <w:vAlign w:val="center"/>
+            <w:hideMark/>
+          </w:tcPr>
+          <w:p>
+            <w:pPr>
+              <w:spacing w:before="0" w:line="240" w:lineRule="auto"/>
+              <w:jc w:val="center"/>
+              <w:rPr>
+                <w:szCs w:val="24"/>
+              </w:rPr>
+            </w:pPr>
+            <w:r>
+              <w:rPr>
+                <w:color w:val="000000"/>
+                <w:sz w:val="20"/>
+              </w:rPr>
+              <w:t>"Success"</w:t>
+            </w:r>
+          </w:p>
+        </w:tc>
+      </w:tr>
+    </w:tbl>
     <w:p>
       <w:pPr>
-        <w:pStyle w:val="ListParagraph"/>
         <w:spacing w:after="120"/>
-        <w:ind w:left="360"/>
         <w:rPr>
           <w:b/>
           <w:bCs/>
@@ -1616,33 +1959,10 @@
         <w:spacing w:after="120"/>
       </w:pPr>
       <w:r>
-        <w:t xml:space="preserve">The software successfully </w:t>
-      </w:r>
-      <w:proofErr w:type="gramStart"/>
-      <w:r>
-        <w:t>r</w:t>
-      </w:r>
-      <w:r>
-        <w:t>ecord</w:t>
-      </w:r>
-      <w:proofErr w:type="gramEnd"/>
-      <w:r>
-        <w:t xml:space="preserve"> Payment </w:t>
-      </w:r>
-      <w:r>
-        <w:t xml:space="preserve">Transaction and </w:t>
-      </w:r>
-      <w:r>
-        <w:t>O</w:t>
-      </w:r>
-      <w:r>
-        <w:t xml:space="preserve">rder </w:t>
-      </w:r>
-      <w:r>
-        <w:t>I</w:t>
-      </w:r>
-      <w:r>
-        <w:t>nformation</w:t>
+        <w:t>The</w:t>
+      </w:r>
+      <w:r>
+        <w:t xml:space="preserve"> payment result is displayed successfully</w:t>
       </w:r>
     </w:p>
     <w:sectPr>
@@ -3373,7 +3693,6 @@
     <w:name w:val="Normal (Web)"/>
     <w:basedOn w:val="Normal"/>
     <w:uiPriority w:val="99"/>
-    <w:semiHidden/>
     <w:unhideWhenUsed/>
     <w:rsid w:val="005A097A"/>
     <w:pPr>

</xml_diff>